<commit_message>
Geschichte 11: Quelleninterpretation nach den Arbeitsschritten der Fachschaft
Übersicht für den Hefter, Schreibplan, Folien und Handreichung auf das
Schema Themenfrage – Analyse – Kontext – Sach-/Werturteil umgestellt.

Co-Authored-By: Claude Opus 5.5 <noreply@anthropic.com>
Claude-Session: https://claude.ai/code/session_013iN4Tiarea1J9YUJHZ9iqC
</commit_message>
<xml_diff>
--- a/Geschichte_11/Doppelstunde_Test_Quellenanalyse/Handreichung_Test_Quellenanalyse.docx
+++ b/Geschichte_11/Doppelstunde_Test_Quellenanalyse/Handreichung_Test_Quellenanalyse.docx
@@ -30,7 +30,7 @@
           <w:sz w:val="34"/>
           <w:szCs w:val="34"/>
         </w:rPr>
-        <w:t xml:space="preserve">Test und Quellenanalyse: Aristoteles über Kleisthenes</w:t>
+        <w:t xml:space="preserve">Test und Quelleninterpretation: Aristoteles über Kleisthenes</w:t>
       </w:r>
     </w:p>
     <w:tbl>
@@ -88,7 +88,7 @@
                 <w:sz w:val="19"/>
                 <w:szCs w:val="19"/>
               </w:rPr>
-              <w:t xml:space="preserve"> Ich kann eine Textquelle mit dem Schreibplan analysieren: Einleitung schreiben und Inhalt wiedergeben.</w:t>
+              <w:t xml:space="preserve"> Ich kann eine Textquelle nach den Arbeitsschritten analysieren: formale und inhaltliche Aspekte.</w:t>
             </w:r>
           </w:p>
           <w:p>
@@ -113,7 +113,7 @@
                 <w:sz w:val="19"/>
                 <w:szCs w:val="19"/>
               </w:rPr>
-              <w:t xml:space="preserve"> Abschlussaufgabe – in einem fehlerhaften Klausur-Anfang drei Fehler erkennen und begründen („Ich rate dir …, weil …“). Erfüllt, wenn mindestens zwei Ratschläge Einleitung (Autor nicht dabei, Angaben fehlen) und Inhaltswiedergabe (indirekte Rede, Zeilen, keine Meinung) treffen.</w:t>
+              <w:t xml:space="preserve"> Abschlussaufgabe – in einem fehlerhaften Klausur-Anfang drei Fehler erkennen und begründen („Ich rate dir …, weil …“). Erfüllt, wenn mindestens zwei Ratschläge formale Analyse (Autor nicht dabei, Angaben fehlen) und inhaltliche Analyse (indirekte Rede, Zeilen, keine Meinung) treffen.</w:t>
             </w:r>
           </w:p>
           <w:p>
@@ -138,7 +138,7 @@
                 <w:sz w:val="19"/>
                 <w:szCs w:val="19"/>
               </w:rPr>
-              <w:t xml:space="preserve"> Schritt 1 (Einleitung) und Schritt 2 (Inhalt) am Aristoteles-Text. Mit *: Schritte 3 und 4.</w:t>
+              <w:t xml:space="preserve"> Themenfrage kennen, Schritt 2a und 2b (formale und inhaltliche Analyse) am Aristoteles-Text. Mit *: Kontext und Urteil (Schritte 3 und 4).</w:t>
             </w:r>
           </w:p>
           <w:p>
@@ -163,7 +163,7 @@
                 <w:sz w:val="19"/>
                 <w:szCs w:val="19"/>
               </w:rPr>
-              <w:t xml:space="preserve"> Die Doppelstunde ist die Methodenstunde zu Montag (Kleisthenes): kein neuer Stoff, sondern derselbe Inhalt aus einer Quelle. Der Schreibplan ist die Vorlage für die Analyseaufgabe in der Klausur am 25.11.</w:t>
+              <w:t xml:space="preserve"> Die Doppelstunde ist die Methodenstunde zu Montag (Kleisthenes): kein neuer Stoff, sondern derselbe Inhalt aus einer Quelle. Übersicht und Schreibplan sind die Vorlage für die Interpretationsaufgabe in der Klausur am 25.11.</w:t>
             </w:r>
           </w:p>
         </w:tc>
@@ -207,7 +207,7 @@
           <w:sz w:val="19"/>
           <w:szCs w:val="19"/>
         </w:rPr>
-        <w:t xml:space="preserve">Hinweis:</w:t>
+        <w:t xml:space="preserve">Grundlage:</w:t>
       </w:r>
       <w:r>
         <w:rPr>
@@ -216,7 +216,7 @@
           <w:sz w:val="19"/>
           <w:szCs w:val="19"/>
         </w:rPr>
-        <w:t xml:space="preserve"> Das hochgeladene Material zur Quellenanalyse lag nicht vor. Der Schreibplan folgt deshalb dem üblichen Vierschritt (Einleitung – Inhalt – Einordnen – Urteilen). Wenn die Fachschaft ein eigenes Schema oder eigene Operatoren nutzt, Folien 6–7 und Seite 2 des Blatts daran anpassen.</w:t>
+        <w:t xml:space="preserve"> Arbeitsschritte der Fachschaft („Arbeitsschritte zur Interpretation einer Textquelle“: Themenfrage – Analyse formal/inhaltlich – historischer Kontext – Sach- und Werturteil), Musterlösung M11 und Hinweise zu Teil C. Die Glaubwürdigkeit steht wie in den Arbeitsschritten beim Sachurteil (im Text „Teil C“ beim Werturteil). Für die Schüler: eigene Übersicht für den Hefter mit Satzanfängen aus den Formulierungshilfen.</w:t>
       </w:r>
     </w:p>
     <w:p>
@@ -489,7 +489,7 @@
                 <w:sz w:val="18"/>
                 <w:szCs w:val="18"/>
               </w:rPr>
-              <w:t xml:space="preserve">Quelle_und_Schreibplan</w:t>
+              <w:t xml:space="preserve">Uebersicht_Quelleninterpretation (für den Hefter)</w:t>
             </w:r>
           </w:p>
         </w:tc>
@@ -520,7 +520,7 @@
                 <w:sz w:val="18"/>
                 <w:szCs w:val="18"/>
               </w:rPr>
-              <w:t xml:space="preserve">A4 doppelseitig</w:t>
+              <w:t xml:space="preserve">A4</w:t>
             </w:r>
           </w:p>
         </w:tc>
@@ -587,7 +587,7 @@
                 <w:sz w:val="18"/>
                 <w:szCs w:val="18"/>
               </w:rPr>
-              <w:t xml:space="preserve">Test_Erwartungshorizont_Notenschluessel</w:t>
+              <w:t xml:space="preserve">Quelle_und_Schreibplan</w:t>
             </w:r>
           </w:p>
         </w:tc>
@@ -618,7 +618,7 @@
                 <w:sz w:val="18"/>
                 <w:szCs w:val="18"/>
               </w:rPr>
-              <w:t xml:space="preserve">A4</w:t>
+              <w:t xml:space="preserve">A4 doppelseitig</w:t>
             </w:r>
           </w:p>
         </w:tc>
@@ -649,7 +649,7 @@
                 <w:sz w:val="18"/>
                 <w:szCs w:val="18"/>
               </w:rPr>
-              <w:t xml:space="preserve">nur Lehrkraft</w:t>
+              <w:t xml:space="preserve">1 je Schüler</w:t>
             </w:r>
           </w:p>
         </w:tc>
@@ -685,7 +685,105 @@
                 <w:sz w:val="18"/>
                 <w:szCs w:val="18"/>
               </w:rPr>
-              <w:t xml:space="preserve">Folien_Quellenanalyse (26 Folien, Teil 1 = Folie 1)</w:t>
+              <w:t xml:space="preserve">Test_Erwartungshorizont_Notenschluessel</w:t>
+            </w:r>
+          </w:p>
+        </w:tc>
+        <w:tc>
+          <w:tcPr>
+            <w:tcW w:type="dxa" w:w="2400"/>
+            <w:tcBorders>
+              <w:top w:val="single" w:color="BFB5A5" w:sz="4"/>
+              <w:left w:val="single" w:color="BFB5A5" w:sz="4"/>
+              <w:bottom w:val="single" w:color="BFB5A5" w:sz="4"/>
+              <w:right w:val="single" w:color="BFB5A5" w:sz="4"/>
+            </w:tcBorders>
+            <w:tcMar>
+              <w:top w:type="dxa" w:w="50"/>
+              <w:left w:type="dxa" w:w="90"/>
+              <w:bottom w:type="dxa" w:w="50"/>
+              <w:right w:type="dxa" w:w="90"/>
+            </w:tcMar>
+          </w:tcPr>
+          <w:p>
+            <w:pPr>
+              <w:spacing w:after="20" w:before="0"/>
+            </w:pPr>
+            <w:r>
+              <w:rPr>
+                <w:rFonts w:ascii="Calibri" w:cs="Calibri" w:eastAsia="Calibri" w:hAnsi="Calibri"/>
+                <w:color w:val="2B2318"/>
+                <w:sz w:val="18"/>
+                <w:szCs w:val="18"/>
+              </w:rPr>
+              <w:t xml:space="preserve">A4</w:t>
+            </w:r>
+          </w:p>
+        </w:tc>
+        <w:tc>
+          <w:tcPr>
+            <w:tcW w:type="dxa" w:w="2038"/>
+            <w:tcBorders>
+              <w:top w:val="single" w:color="BFB5A5" w:sz="4"/>
+              <w:left w:val="single" w:color="BFB5A5" w:sz="4"/>
+              <w:bottom w:val="single" w:color="BFB5A5" w:sz="4"/>
+              <w:right w:val="single" w:color="BFB5A5" w:sz="4"/>
+            </w:tcBorders>
+            <w:tcMar>
+              <w:top w:type="dxa" w:w="50"/>
+              <w:left w:type="dxa" w:w="90"/>
+              <w:bottom w:type="dxa" w:w="50"/>
+              <w:right w:type="dxa" w:w="90"/>
+            </w:tcMar>
+          </w:tcPr>
+          <w:p>
+            <w:pPr>
+              <w:spacing w:after="20" w:before="0"/>
+            </w:pPr>
+            <w:r>
+              <w:rPr>
+                <w:rFonts w:ascii="Calibri" w:cs="Calibri" w:eastAsia="Calibri" w:hAnsi="Calibri"/>
+                <w:color w:val="2B2318"/>
+                <w:sz w:val="18"/>
+                <w:szCs w:val="18"/>
+              </w:rPr>
+              <w:t xml:space="preserve">nur Lehrkraft</w:t>
+            </w:r>
+          </w:p>
+        </w:tc>
+      </w:tr>
+      <w:tr>
+        <w:trPr>
+          <w:cantSplit/>
+        </w:trPr>
+        <w:tc>
+          <w:tcPr>
+            <w:tcW w:type="dxa" w:w="5200"/>
+            <w:tcBorders>
+              <w:top w:val="single" w:color="BFB5A5" w:sz="4"/>
+              <w:left w:val="single" w:color="BFB5A5" w:sz="4"/>
+              <w:bottom w:val="single" w:color="BFB5A5" w:sz="4"/>
+              <w:right w:val="single" w:color="BFB5A5" w:sz="4"/>
+            </w:tcBorders>
+            <w:tcMar>
+              <w:top w:type="dxa" w:w="50"/>
+              <w:left w:type="dxa" w:w="90"/>
+              <w:bottom w:type="dxa" w:w="50"/>
+              <w:right w:type="dxa" w:w="90"/>
+            </w:tcMar>
+          </w:tcPr>
+          <w:p>
+            <w:pPr>
+              <w:spacing w:after="20" w:before="0"/>
+            </w:pPr>
+            <w:r>
+              <w:rPr>
+                <w:rFonts w:ascii="Calibri" w:cs="Calibri" w:eastAsia="Calibri" w:hAnsi="Calibri"/>
+                <w:color w:val="2B2318"/>
+                <w:sz w:val="18"/>
+                <w:szCs w:val="18"/>
+              </w:rPr>
+              <w:t xml:space="preserve">Folien_Quellenanalyse (28 Folien, Teil 1 = Folie 1)</w:t>
             </w:r>
           </w:p>
         </w:tc>
@@ -809,7 +907,7 @@
           <w:sz w:val="19"/>
           <w:szCs w:val="19"/>
         </w:rPr>
-        <w:t xml:space="preserve">–  Wer früher fertig ist, dreht das Blatt um und bleibt sitzen; nach dem Einsammeln direkt Blatt „Quelle und Schreibplan“ austeilen.</w:t>
+        <w:t xml:space="preserve">–  Wer früher fertig ist, dreht das Blatt um und bleibt sitzen; nach dem Einsammeln direkt Übersicht und Blatt „Quelle und Schreibplan“ austeilen.</w:t>
       </w:r>
     </w:p>
     <w:p>
@@ -1083,6 +1181,84 @@
                 <w:sz w:val="18"/>
                 <w:szCs w:val="18"/>
               </w:rPr>
+              <w:t xml:space="preserve">Themenfrage, Textart, Textsprache</w:t>
+            </w:r>
+          </w:p>
+        </w:tc>
+        <w:tc>
+          <w:tcPr>
+            <w:tcW w:type="dxa" w:w="6638"/>
+            <w:tcBorders>
+              <w:top w:val="single" w:color="BFB5A5" w:sz="4"/>
+              <w:left w:val="single" w:color="BFB5A5" w:sz="4"/>
+              <w:bottom w:val="single" w:color="BFB5A5" w:sz="4"/>
+              <w:right w:val="single" w:color="BFB5A5" w:sz="4"/>
+            </w:tcBorders>
+            <w:tcMar>
+              <w:top w:type="dxa" w:w="50"/>
+              <w:left w:type="dxa" w:w="90"/>
+              <w:bottom w:type="dxa" w:w="50"/>
+              <w:right w:type="dxa" w:w="90"/>
+            </w:tcMar>
+          </w:tcPr>
+          <w:p>
+            <w:pPr>
+              <w:spacing w:after="20" w:before="0"/>
+            </w:pPr>
+            <w:r>
+              <w:rPr>
+                <w:rFonts w:ascii="Calibri" w:cs="Calibri" w:eastAsia="Calibri" w:hAnsi="Calibri"/>
+                <w:b/>
+                <w:bCs/>
+                <w:color w:val="2B2318"/>
+                <w:sz w:val="18"/>
+                <w:szCs w:val="18"/>
+              </w:rPr>
+              <w:t xml:space="preserve">neu als Begriffe</w:t>
+            </w:r>
+            <w:r>
+              <w:rPr>
+                <w:rFonts w:ascii="Calibri" w:cs="Calibri" w:eastAsia="Calibri" w:hAnsi="Calibri"/>
+                <w:color w:val="2B2318"/>
+                <w:sz w:val="18"/>
+                <w:szCs w:val="18"/>
+              </w:rPr>
+              <w:t xml:space="preserve"> – Übersicht im Hefter, Folien 7–9</w:t>
+            </w:r>
+          </w:p>
+        </w:tc>
+      </w:tr>
+      <w:tr>
+        <w:trPr>
+          <w:cantSplit/>
+        </w:trPr>
+        <w:tc>
+          <w:tcPr>
+            <w:tcW w:type="dxa" w:w="3000"/>
+            <w:tcBorders>
+              <w:top w:val="single" w:color="BFB5A5" w:sz="4"/>
+              <w:left w:val="single" w:color="BFB5A5" w:sz="4"/>
+              <w:bottom w:val="single" w:color="BFB5A5" w:sz="4"/>
+              <w:right w:val="single" w:color="BFB5A5" w:sz="4"/>
+            </w:tcBorders>
+            <w:tcMar>
+              <w:top w:type="dxa" w:w="50"/>
+              <w:left w:type="dxa" w:w="90"/>
+              <w:bottom w:type="dxa" w:w="50"/>
+              <w:right w:type="dxa" w:w="90"/>
+            </w:tcMar>
+          </w:tcPr>
+          <w:p>
+            <w:pPr>
+              <w:spacing w:after="20" w:before="0"/>
+            </w:pPr>
+            <w:r>
+              <w:rPr>
+                <w:rFonts w:ascii="Calibri" w:cs="Calibri" w:eastAsia="Calibri" w:hAnsi="Calibri"/>
+                <w:color w:val="2B2318"/>
+                <w:sz w:val="18"/>
+                <w:szCs w:val="18"/>
+              </w:rPr>
               <w:t xml:space="preserve">Sinnabschnitt, indirekte Rede</w:t>
             </w:r>
           </w:p>
@@ -1114,7 +1290,7 @@
                 <w:sz w:val="18"/>
                 <w:szCs w:val="18"/>
               </w:rPr>
-              <w:t xml:space="preserve">aus Deutsch bekannt – Prüffrage auf Folie 14</w:t>
+              <w:t xml:space="preserve">aus Deutsch bekannt – Prüffrage auf Folie 15</w:t>
             </w:r>
           </w:p>
         </w:tc>
@@ -1548,7 +1724,7 @@
                 <w:sz w:val="16"/>
                 <w:szCs w:val="16"/>
               </w:rPr>
-              <w:t xml:space="preserve">Tests einsammeln, Blatt austeilen. Ziel und Ablauf: „Heute lernt ihr, wie man in der Klausur mit einer Quelle umgeht – Schritt für Schritt.“</w:t>
+              <w:t xml:space="preserve">Tests einsammeln, Übersicht und Arbeitsblatt austeilen. Ziel und Ablauf: „Heute lernt ihr, wie man in der Klausur eine Quelle interpretiert – Schritt für Schritt.“</w:t>
             </w:r>
           </w:p>
         </w:tc>
@@ -1781,7 +1957,7 @@
                 <w:sz w:val="16"/>
                 <w:szCs w:val="16"/>
               </w:rPr>
-              <w:t xml:space="preserve">Echte Wiederholung von Montag und Begriff „Quelle“ aktivieren, beides braucht die Analyse (direkt).</w:t>
+              <w:t xml:space="preserve">Echte Wiederholung von Montag und Begriff „Quelle“ aktivieren, beides braucht die Interpretation (direkt).</w:t>
             </w:r>
           </w:p>
         </w:tc>
@@ -1952,7 +2128,7 @@
                 <w:sz w:val="16"/>
                 <w:szCs w:val="16"/>
               </w:rPr>
-              <w:t xml:space="preserve">„In der Klausur ist die erste Aufgabe meist: Analysiere die Quelle.“</w:t>
+              <w:t xml:space="preserve">„In der Klausur heißt die Aufgabe oft: Interpretieren Sie die Quelle.“ Operatoren kurz nennen.</w:t>
             </w:r>
           </w:p>
         </w:tc>
@@ -2154,7 +2330,7 @@
                 <w:sz w:val="16"/>
                 <w:szCs w:val="16"/>
               </w:rPr>
-              <w:t xml:space="preserve">Der Schreibplan in vier Schritten. Warnung: nicht nacherzählen. Prüffragen an 4–6 Schüler.</w:t>
+              <w:t xml:space="preserve">Die vier Arbeitsschritte mit der Übersicht im Hefter, dann die vorgegebene Themenfrage. Warnung: erst untersuchen, dann urteilen. Prüffragen an 4–6 Schüler.</w:t>
             </w:r>
           </w:p>
         </w:tc>
@@ -2185,7 +2361,7 @@
                 <w:sz w:val="16"/>
                 <w:szCs w:val="16"/>
               </w:rPr>
-              <w:t xml:space="preserve">Überblick vor den Einzelschritten (direkt, neue Kompetenz).</w:t>
+              <w:t xml:space="preserve">Überblick vor den Einzelschritten (direkt, neue Kompetenz); Themenfrage gibt der Analyse eine Richtung.</w:t>
             </w:r>
           </w:p>
         </w:tc>
@@ -2247,7 +2423,7 @@
                 <w:sz w:val="16"/>
                 <w:szCs w:val="16"/>
               </w:rPr>
-              <w:t xml:space="preserve">7</w:t>
+              <w:t xml:space="preserve">7–8</w:t>
             </w:r>
           </w:p>
         </w:tc>
@@ -2356,7 +2532,7 @@
                 <w:sz w:val="16"/>
                 <w:szCs w:val="16"/>
               </w:rPr>
-              <w:t xml:space="preserve">Fünf W-Fragen der Einleitung; an Solons Gedicht laut denkend vormachen, Einleitungssatz zeigen. Warnung: Lebensdaten prüfen.</w:t>
+              <w:t xml:space="preserve">2a formale Aspekte (Autor, Zeit und Ort, Textart, Thema, Adressat); an Solons Gedicht laut denkend vormachen, Einleitungssatz zeigen. Warnung: Lebensdaten prüfen.</w:t>
             </w:r>
           </w:p>
         </w:tc>
@@ -2449,7 +2625,7 @@
                 <w:sz w:val="16"/>
                 <w:szCs w:val="16"/>
               </w:rPr>
-              <w:t xml:space="preserve">8–10</w:t>
+              <w:t xml:space="preserve">9–11</w:t>
             </w:r>
           </w:p>
         </w:tc>
@@ -2527,7 +2703,7 @@
                 <w:sz w:val="16"/>
                 <w:szCs w:val="16"/>
               </w:rPr>
-              <w:t xml:space="preserve"> Einleitung</w:t>
+              <w:t xml:space="preserve"> Formale Aspekte</w:t>
             </w:r>
           </w:p>
         </w:tc>
@@ -2558,7 +2734,7 @@
                 <w:sz w:val="16"/>
                 <w:szCs w:val="16"/>
               </w:rPr>
-              <w:t xml:space="preserve">Allein: fünf Felder ausfüllen, Einleitungssatz (4). Zwei lesen vor, Lösung (2).</w:t>
+              <w:t xml:space="preserve">Allein: fünf Felder in 2a ausfüllen, Einleitungssatz (4). Zwei lesen vor, Lösung (2).</w:t>
             </w:r>
           </w:p>
         </w:tc>
@@ -2651,7 +2827,7 @@
                 <w:sz w:val="16"/>
                 <w:szCs w:val="16"/>
               </w:rPr>
-              <w:t xml:space="preserve">11–13</w:t>
+              <w:t xml:space="preserve">12–14</w:t>
             </w:r>
           </w:p>
         </w:tc>
@@ -2760,7 +2936,7 @@
                 <w:sz w:val="16"/>
                 <w:szCs w:val="16"/>
               </w:rPr>
-              <w:t xml:space="preserve">Regeln für die Inhaltswiedergabe (Sinnabschnitte, eigene Worte, indirekte Rede, Zeilen). Warnung: keine Meinung. Abschnitt Z. 1–4 laut denkend vormachen.</w:t>
+              <w:t xml:space="preserve">2b inhaltliche Aspekte (wesentliche Aussagen, eigene Worte, indirekte Rede, Zeilen, Schlüsselbegriffe, Textsprache). Warnung: keine Meinung. Abschnitt Z. 1–4 laut denkend vormachen.</w:t>
             </w:r>
           </w:p>
         </w:tc>
@@ -2853,7 +3029,7 @@
                 <w:sz w:val="16"/>
                 <w:szCs w:val="16"/>
               </w:rPr>
-              <w:t xml:space="preserve">14–15</w:t>
+              <w:t xml:space="preserve">15–16</w:t>
             </w:r>
           </w:p>
         </w:tc>
@@ -2931,7 +3107,7 @@
                 <w:sz w:val="16"/>
                 <w:szCs w:val="16"/>
               </w:rPr>
-              <w:t xml:space="preserve"> Inhalt</w:t>
+              <w:t xml:space="preserve"> Inhaltliche Aspekte</w:t>
             </w:r>
           </w:p>
         </w:tc>
@@ -2962,7 +3138,7 @@
                 <w:sz w:val="16"/>
                 <w:szCs w:val="16"/>
               </w:rPr>
-              <w:t xml:space="preserve">Paare: Z. 5–8 mit Satzanfang und Stichworten, Z. 9–12 mit Satzanfang, Z. 12–14 ohne Hilfe (10). Quelle an der Wand. Je Abschnitt ein Paar vom Platz, Lösung (3).</w:t>
+              <w:t xml:space="preserve">Paare: Z. 5–8 mit Satzanfang und Stichworten, Z. 9–12 mit Satzanfang, Z. 12–14 ohne Hilfe, dann Begriffe und Textsprache (10). Quelle an der Wand. Je Abschnitt ein Paar vom Platz, Lösung (3).</w:t>
             </w:r>
           </w:p>
         </w:tc>
@@ -3055,7 +3231,7 @@
                 <w:sz w:val="16"/>
                 <w:szCs w:val="16"/>
               </w:rPr>
-              <w:t xml:space="preserve">16–22</w:t>
+              <w:t xml:space="preserve">17–24</w:t>
             </w:r>
           </w:p>
         </w:tc>
@@ -3133,7 +3309,7 @@
                 <w:sz w:val="16"/>
                 <w:szCs w:val="16"/>
               </w:rPr>
-              <w:t xml:space="preserve"> Schritte 3 und 4*</w:t>
+              <w:t xml:space="preserve"> Kontext und Urteil*</w:t>
             </w:r>
           </w:p>
         </w:tc>
@@ -3164,7 +3340,7 @@
                 <w:sz w:val="16"/>
                 <w:szCs w:val="16"/>
               </w:rPr>
-              <w:t xml:space="preserve">Nur bei Zeit: Kontext (Sturz der Tyrannis) und Glaubwürdigkeit (180 Jahre später) kurz erklären, zwei Prüffragen.</w:t>
+              <w:t xml:space="preserve">Nur bei Zeit: Kontext (Sturz der Tyrannis) und Sachurteil zur Glaubwürdigkeit (180 Jahre später) kurz erklären, zwei Prüffragen.</w:t>
             </w:r>
           </w:p>
         </w:tc>
@@ -3257,7 +3433,7 @@
                 <w:sz w:val="16"/>
                 <w:szCs w:val="16"/>
               </w:rPr>
-              <w:t xml:space="preserve">23</w:t>
+              <w:t xml:space="preserve">25</w:t>
             </w:r>
           </w:p>
         </w:tc>
@@ -3397,7 +3573,7 @@
                 <w:sz w:val="16"/>
                 <w:szCs w:val="16"/>
               </w:rPr>
-              <w:t xml:space="preserve">Prüft genau das Ziel: Fehler in Einleitung und Inhalt erkennen und begründen. </w:t>
+              <w:t xml:space="preserve">Prüft genau das Ziel: Fehler in formaler und inhaltlicher Analyse erkennen und begründen. </w:t>
             </w:r>
             <w:r>
               <w:rPr>
@@ -3470,7 +3646,7 @@
                 <w:sz w:val="16"/>
                 <w:szCs w:val="16"/>
               </w:rPr>
-              <w:t xml:space="preserve">24–26</w:t>
+              <w:t xml:space="preserve">26–28</w:t>
             </w:r>
           </w:p>
         </w:tc>
@@ -3495,7 +3671,6 @@
     </w:p>
     <w:p>
       <w:pPr>
-        <w:keepNext/>
         <w:spacing w:after="70" w:before="0"/>
       </w:pPr>
       <w:r>
@@ -3507,7 +3682,33 @@
           <w:sz w:val="19"/>
           <w:szCs w:val="19"/>
         </w:rPr>
-        <w:t xml:space="preserve">Schritt 1 – Einleitung</w:t>
+        <w:t xml:space="preserve">1 Themenfrage (vorgegeben):</w:t>
+      </w:r>
+      <w:r>
+        <w:rPr>
+          <w:rFonts w:ascii="Calibri" w:cs="Calibri" w:eastAsia="Calibri" w:hAnsi="Calibri"/>
+          <w:color w:val="2B2318"/>
+          <w:sz w:val="19"/>
+          <w:szCs w:val="19"/>
+        </w:rPr>
+        <w:t xml:space="preserve"> Wie veränderte Kleisthenes laut Aristoteles die Ordnung Athens – und mit welchem Ziel?</w:t>
+      </w:r>
+    </w:p>
+    <w:p>
+      <w:pPr>
+        <w:keepNext/>
+        <w:spacing w:after="70" w:before="60"/>
+      </w:pPr>
+      <w:r>
+        <w:rPr>
+          <w:rFonts w:ascii="Calibri" w:cs="Calibri" w:eastAsia="Calibri" w:hAnsi="Calibri"/>
+          <w:b/>
+          <w:bCs/>
+          <w:color w:val="2B2318"/>
+          <w:sz w:val="19"/>
+          <w:szCs w:val="19"/>
+        </w:rPr>
+        <w:t xml:space="preserve">2a – Formale Aspekte</w:t>
       </w:r>
     </w:p>
     <w:tbl>
@@ -3632,7 +3833,7 @@
                 <w:sz w:val="18"/>
                 <w:szCs w:val="18"/>
               </w:rPr>
-              <w:t xml:space="preserve">Quellenart</w:t>
+              <w:t xml:space="preserve">Zeit und Ort</w:t>
             </w:r>
           </w:p>
         </w:tc>
@@ -3665,7 +3866,7 @@
                 <w:sz w:val="18"/>
                 <w:szCs w:val="18"/>
               </w:rPr>
-              <w:t xml:space="preserve">Sachtext: Schrift über die Verfassung Athens</w:t>
+              <w:t xml:space="preserve">um 330 v. Chr. in Athen (rund 180 Jahre nach den Reformen)</w:t>
             </w:r>
           </w:p>
         </w:tc>
@@ -3704,7 +3905,7 @@
                 <w:sz w:val="18"/>
                 <w:szCs w:val="18"/>
               </w:rPr>
-              <w:t xml:space="preserve">Entstehungszeit</w:t>
+              <w:t xml:space="preserve">Textart</w:t>
             </w:r>
           </w:p>
         </w:tc>
@@ -3737,7 +3938,7 @@
                 <w:sz w:val="18"/>
                 <w:szCs w:val="18"/>
               </w:rPr>
-              <w:t xml:space="preserve">um 330 v. Chr. (rund 180 Jahre nach den Reformen)</w:t>
+              <w:t xml:space="preserve">Sachtext: Schrift über die Geschichte der Verfassung Athens</w:t>
             </w:r>
           </w:p>
         </w:tc>
@@ -3776,7 +3977,7 @@
                 <w:sz w:val="18"/>
                 <w:szCs w:val="18"/>
               </w:rPr>
-              <w:t xml:space="preserve">Adressat</w:t>
+              <w:t xml:space="preserve">Thema</w:t>
             </w:r>
           </w:p>
         </w:tc>
@@ -3809,7 +4010,7 @@
                 <w:sz w:val="18"/>
                 <w:szCs w:val="18"/>
               </w:rPr>
-              <w:t xml:space="preserve">seine Schüler und gebildete Leser</w:t>
+              <w:t xml:space="preserve">die Reformen des Kleisthenes (508/07 v. Chr.)</w:t>
             </w:r>
           </w:p>
         </w:tc>
@@ -3848,7 +4049,7 @@
                 <w:sz w:val="18"/>
                 <w:szCs w:val="18"/>
               </w:rPr>
-              <w:t xml:space="preserve">Thema</w:t>
+              <w:t xml:space="preserve">Adressat</w:t>
             </w:r>
           </w:p>
         </w:tc>
@@ -3881,7 +4082,7 @@
                 <w:sz w:val="18"/>
                 <w:szCs w:val="18"/>
               </w:rPr>
-              <w:t xml:space="preserve">die Reformen des Kleisthenes (508/07 v. Chr.)</w:t>
+              <w:t xml:space="preserve">seine Schüler und gebildete Leser</w:t>
             </w:r>
           </w:p>
         </w:tc>
@@ -3900,7 +4101,7 @@
           <w:sz w:val="19"/>
           <w:szCs w:val="19"/>
         </w:rPr>
-        <w:t xml:space="preserve">Einleitungssatz: „Bei der Quelle handelt es sich um einen Auszug aus der Schrift „Der Staat der Athener“ des griechischen Philosophen Aristoteles, die um 330 v. Chr. entstand. Sie richtet sich an seine Schüler und gebildete Leser und behandelt die Reformen des Kleisthenes 508/07 v. Chr.“</w:t>
+        <w:t xml:space="preserve">Einleitungssatz: „Bei der Quelle handelt es sich um einen Auszug aus der Schrift „Der Staat der Athener“ des griechischen Philosophen Aristoteles, die um 330 v. Chr. in Athen entstand. Sie richtet sich an seine Schüler und gebildete Leser und behandelt die Reformen des Kleisthenes 508/07 v. Chr.“</w:t>
       </w:r>
     </w:p>
     <w:p>
@@ -3917,7 +4118,7 @@
           <w:sz w:val="19"/>
           <w:szCs w:val="19"/>
         </w:rPr>
-        <w:t xml:space="preserve">Schritt 2 – Inhalt</w:t>
+        <w:t xml:space="preserve">2b – Inhaltliche Aspekte</w:t>
       </w:r>
       <w:r>
         <w:rPr>
@@ -4309,6 +4510,51 @@
     </w:tbl>
     <w:p>
       <w:pPr>
+        <w:spacing w:after="70" w:before="80"/>
+      </w:pPr>
+      <w:r>
+        <w:rPr>
+          <w:rFonts w:ascii="Calibri" w:cs="Calibri" w:eastAsia="Calibri" w:hAnsi="Calibri"/>
+          <w:b/>
+          <w:bCs/>
+          <w:color w:val="2B2318"/>
+          <w:sz w:val="19"/>
+          <w:szCs w:val="19"/>
+        </w:rPr>
+        <w:t xml:space="preserve">Schlüsselbegriffe:</w:t>
+      </w:r>
+      <w:r>
+        <w:rPr>
+          <w:rFonts w:ascii="Calibri" w:cs="Calibri" w:eastAsia="Calibri" w:hAnsi="Calibri"/>
+          <w:color w:val="2B2318"/>
+          <w:sz w:val="19"/>
+          <w:szCs w:val="19"/>
+        </w:rPr>
+        <w:t xml:space="preserve"> Phylen – vermischen – Rat der 500 – Trittyen – Demos · </w:t>
+      </w:r>
+      <w:r>
+        <w:rPr>
+          <w:rFonts w:ascii="Calibri" w:cs="Calibri" w:eastAsia="Calibri" w:hAnsi="Calibri"/>
+          <w:b/>
+          <w:bCs/>
+          <w:color w:val="2B2318"/>
+          <w:sz w:val="19"/>
+          <w:szCs w:val="19"/>
+        </w:rPr>
+        <w:t xml:space="preserve">Textsprache:</w:t>
+      </w:r>
+      <w:r>
+        <w:rPr>
+          <w:rFonts w:ascii="Calibri" w:cs="Calibri" w:eastAsia="Calibri" w:hAnsi="Calibri"/>
+          <w:color w:val="2B2318"/>
+          <w:sz w:val="19"/>
+          <w:szCs w:val="19"/>
+        </w:rPr>
+        <w:t xml:space="preserve"> sachlich und erklärend: Aristoteles zählt die Maßnahmen geordnet auf und nennt mit „damit …“ jeweils ihren Zweck (Z. 7, 11, 13).</w:t>
+      </w:r>
+    </w:p>
+    <w:p>
+      <w:pPr>
         <w:spacing w:after="70" w:before="100"/>
       </w:pPr>
       <w:r>
@@ -4320,7 +4566,7 @@
           <w:sz w:val="19"/>
           <w:szCs w:val="19"/>
         </w:rPr>
-        <w:t xml:space="preserve">Schritt 3 – Einordnen (nur bei Zeit):</w:t>
+        <w:t xml:space="preserve">3 – Historischer Kontext (nur bei Zeit):</w:t>
       </w:r>
       <w:r>
         <w:rPr>
@@ -4345,7 +4591,7 @@
           <w:sz w:val="19"/>
           <w:szCs w:val="19"/>
         </w:rPr>
-        <w:t xml:space="preserve">Schritt 4 – Urteilen (nur bei Zeit):</w:t>
+        <w:t xml:space="preserve">4a – Sachurteil (nur bei Zeit):</w:t>
       </w:r>
       <w:r>
         <w:rPr>
@@ -4355,6 +4601,31 @@
           <w:szCs w:val="19"/>
         </w:rPr>
         <w:t xml:space="preserve"> Aristoteles war kein Augenzeuge; er schrieb rund 180 Jahre später und stützte sich auf ältere Schriften. Er nennt Absichten („damit …“), die er selbst so deutet. Die Angaben zu Phylen, Rat und Trittyen passen aber zu anderen Überlieferungen – als Quelle für die Ordnung gut brauchbar, für die Absichten des Kleisthenes nur eingeschränkt.</w:t>
+      </w:r>
+    </w:p>
+    <w:p>
+      <w:pPr>
+        <w:spacing w:after="70" w:before="0"/>
+      </w:pPr>
+      <w:r>
+        <w:rPr>
+          <w:rFonts w:ascii="Calibri" w:cs="Calibri" w:eastAsia="Calibri" w:hAnsi="Calibri"/>
+          <w:b/>
+          <w:bCs/>
+          <w:color w:val="2B2318"/>
+          <w:sz w:val="19"/>
+          <w:szCs w:val="19"/>
+        </w:rPr>
+        <w:t xml:space="preserve">4b – Werturteil (nächste Doppelstunde):</w:t>
+      </w:r>
+      <w:r>
+        <w:rPr>
+          <w:rFonts w:ascii="Calibri" w:cs="Calibri" w:eastAsia="Calibri" w:hAnsi="Calibri"/>
+          <w:color w:val="2B2318"/>
+          <w:sz w:val="19"/>
+          <w:szCs w:val="19"/>
+        </w:rPr>
+        <w:t xml:space="preserve"> z. B. „Gemessen an der Gleichheit aller Menschen halte ich die Reform für einen großen, aber unvollständigen Schritt, weil sie viel mehr Bürger beteiligte, Frauen, Sklaven und Fremde aber ausschloss.“ Bezug zur Themenfrage: Aristoteles stellt die Reform als gezielte Beteiligung des Volkes dar.</w:t>
       </w:r>
     </w:p>
     <w:p>
@@ -4561,7 +4832,7 @@
                 <w:sz w:val="18"/>
                 <w:szCs w:val="18"/>
               </w:rPr>
-              <w:t xml:space="preserve">Entstehungszeit = 508/07</w:t>
+              <w:t xml:space="preserve">Zeit = 508/07</w:t>
             </w:r>
           </w:p>
         </w:tc>
@@ -5000,7 +5271,7 @@
           <w:sz w:val="19"/>
           <w:szCs w:val="19"/>
         </w:rPr>
-        <w:t xml:space="preserve">–  Ich rate dir, Quellenart, Entstehungszeit und Adressat zu nennen, weil die Einleitung sonst unvollständig ist.</w:t>
+        <w:t xml:space="preserve">–  Ich rate dir, Textart, Zeit und Ort sowie Adressat zu nennen, weil die Einleitung sonst unvollständig ist.</w:t>
       </w:r>
     </w:p>
     <w:p>

</xml_diff>

<commit_message>
Geschichte 11: Übersicht Quelleninterpretation anschaulicher, formale Analyse mit TATTE(A)
Co-Authored-By: Claude Opus 5.5 <noreply@anthropic.com>
Claude-Session: https://claude.ai/code/session_013iN4Tiarea1J9YUJHZ9iqC
</commit_message>
<xml_diff>
--- a/Geschichte_11/Doppelstunde_Test_Quellenanalyse/Handreichung_Test_Quellenanalyse.docx
+++ b/Geschichte_11/Doppelstunde_Test_Quellenanalyse/Handreichung_Test_Quellenanalyse.docx
@@ -1181,7 +1181,74 @@
                 <w:sz w:val="18"/>
                 <w:szCs w:val="18"/>
               </w:rPr>
-              <w:t xml:space="preserve">Themenfrage, Textart, Textsprache</w:t>
+              <w:t xml:space="preserve">TATTE(A)</w:t>
+            </w:r>
+          </w:p>
+        </w:tc>
+        <w:tc>
+          <w:tcPr>
+            <w:tcW w:type="dxa" w:w="6638"/>
+            <w:tcBorders>
+              <w:top w:val="single" w:color="BFB5A5" w:sz="4"/>
+              <w:left w:val="single" w:color="BFB5A5" w:sz="4"/>
+              <w:bottom w:val="single" w:color="BFB5A5" w:sz="4"/>
+              <w:right w:val="single" w:color="BFB5A5" w:sz="4"/>
+            </w:tcBorders>
+            <w:tcMar>
+              <w:top w:type="dxa" w:w="50"/>
+              <w:left w:type="dxa" w:w="90"/>
+              <w:bottom w:type="dxa" w:w="50"/>
+              <w:right w:type="dxa" w:w="90"/>
+            </w:tcMar>
+          </w:tcPr>
+          <w:p>
+            <w:pPr>
+              <w:spacing w:after="20" w:before="0"/>
+            </w:pPr>
+            <w:r>
+              <w:rPr>
+                <w:rFonts w:ascii="Calibri" w:cs="Calibri" w:eastAsia="Calibri" w:hAnsi="Calibri"/>
+                <w:color w:val="2B2318"/>
+                <w:sz w:val="18"/>
+                <w:szCs w:val="18"/>
+              </w:rPr>
+              <w:t xml:space="preserve">bekannt (Übungsblatt) – Folie 9 erinnert, Übersicht im Hefter</w:t>
+            </w:r>
+          </w:p>
+        </w:tc>
+      </w:tr>
+      <w:tr>
+        <w:trPr>
+          <w:cantSplit/>
+        </w:trPr>
+        <w:tc>
+          <w:tcPr>
+            <w:tcW w:type="dxa" w:w="3000"/>
+            <w:tcBorders>
+              <w:top w:val="single" w:color="BFB5A5" w:sz="4"/>
+              <w:left w:val="single" w:color="BFB5A5" w:sz="4"/>
+              <w:bottom w:val="single" w:color="BFB5A5" w:sz="4"/>
+              <w:right w:val="single" w:color="BFB5A5" w:sz="4"/>
+            </w:tcBorders>
+            <w:tcMar>
+              <w:top w:type="dxa" w:w="50"/>
+              <w:left w:type="dxa" w:w="90"/>
+              <w:bottom w:type="dxa" w:w="50"/>
+              <w:right w:type="dxa" w:w="90"/>
+            </w:tcMar>
+          </w:tcPr>
+          <w:p>
+            <w:pPr>
+              <w:spacing w:after="20" w:before="0"/>
+            </w:pPr>
+            <w:r>
+              <w:rPr>
+                <w:rFonts w:ascii="Calibri" w:cs="Calibri" w:eastAsia="Calibri" w:hAnsi="Calibri"/>
+                <w:color w:val="2B2318"/>
+                <w:sz w:val="18"/>
+                <w:szCs w:val="18"/>
+              </w:rPr>
+              <w:t xml:space="preserve">Themenfrage, Textsprache</w:t>
             </w:r>
           </w:p>
         </w:tc>
@@ -1223,7 +1290,7 @@
                 <w:sz w:val="18"/>
                 <w:szCs w:val="18"/>
               </w:rPr>
-              <w:t xml:space="preserve"> – Übersicht im Hefter, Folien 7–9</w:t>
+              <w:t xml:space="preserve"> – Übersicht im Hefter, Folien 7–8</w:t>
             </w:r>
           </w:p>
         </w:tc>
@@ -2532,7 +2599,7 @@
                 <w:sz w:val="16"/>
                 <w:szCs w:val="16"/>
               </w:rPr>
-              <w:t xml:space="preserve">2a formale Aspekte (Autor, Zeit und Ort, Textart, Thema, Adressat); an Solons Gedicht laut denkend vormachen, Einleitungssatz zeigen. Warnung: Lebensdaten prüfen.</w:t>
+              <w:t xml:space="preserve">2a formale Aspekte mit der bekannten TATTE(A)-Formel (Titel, Autor, Textsorte, Thema, Entstehung, Adressat); an Solons Gedicht laut denkend vormachen, Einleitungssatz zeigen. Warnung: Lebensdaten prüfen.</w:t>
             </w:r>
           </w:p>
         </w:tc>
@@ -2734,7 +2801,7 @@
                 <w:sz w:val="16"/>
                 <w:szCs w:val="16"/>
               </w:rPr>
-              <w:t xml:space="preserve">Allein: fünf Felder in 2a ausfüllen, Einleitungssatz (4). Zwei lesen vor, Lösung (2).</w:t>
+              <w:t xml:space="preserve">Allein: sechs TATTE(A)-Felder in 2a ausfüllen, Einleitungssatz (4). Zwei lesen vor, Lösung (2).</w:t>
             </w:r>
           </w:p>
         </w:tc>
@@ -3761,7 +3828,7 @@
                 <w:sz w:val="18"/>
                 <w:szCs w:val="18"/>
               </w:rPr>
-              <w:t xml:space="preserve">Autor</w:t>
+              <w:t xml:space="preserve">Titel</w:t>
             </w:r>
           </w:p>
         </w:tc>
@@ -3794,7 +3861,7 @@
                 <w:sz w:val="18"/>
                 <w:szCs w:val="18"/>
               </w:rPr>
-              <w:t xml:space="preserve">Aristoteles, griechischer Philosoph (384–322 v. Chr.), lebte in Athen, kein Bürger</w:t>
+              <w:t xml:space="preserve">„Der Staat der Athener“ (Athenaion politeia), Auszug</w:t>
             </w:r>
           </w:p>
         </w:tc>
@@ -3833,7 +3900,7 @@
                 <w:sz w:val="18"/>
                 <w:szCs w:val="18"/>
               </w:rPr>
-              <w:t xml:space="preserve">Zeit und Ort</w:t>
+              <w:t xml:space="preserve">Autor</w:t>
             </w:r>
           </w:p>
         </w:tc>
@@ -3866,7 +3933,7 @@
                 <w:sz w:val="18"/>
                 <w:szCs w:val="18"/>
               </w:rPr>
-              <w:t xml:space="preserve">um 330 v. Chr. in Athen (rund 180 Jahre nach den Reformen)</w:t>
+              <w:t xml:space="preserve">Aristoteles, griechischer Philosoph (384–322 v. Chr.), lebte in Athen, kein Bürger</w:t>
             </w:r>
           </w:p>
         </w:tc>
@@ -3905,7 +3972,7 @@
                 <w:sz w:val="18"/>
                 <w:szCs w:val="18"/>
               </w:rPr>
-              <w:t xml:space="preserve">Textart</w:t>
+              <w:t xml:space="preserve">Textsorte</w:t>
             </w:r>
           </w:p>
         </w:tc>
@@ -4011,6 +4078,78 @@
                 <w:szCs w:val="18"/>
               </w:rPr>
               <w:t xml:space="preserve">die Reformen des Kleisthenes (508/07 v. Chr.)</w:t>
+            </w:r>
+          </w:p>
+        </w:tc>
+      </w:tr>
+      <w:tr>
+        <w:trPr>
+          <w:cantSplit/>
+        </w:trPr>
+        <w:tc>
+          <w:tcPr>
+            <w:tcW w:type="dxa" w:w="2200"/>
+            <w:tcBorders>
+              <w:top w:val="single" w:color="BFB5A5" w:sz="4"/>
+              <w:left w:val="single" w:color="BFB5A5" w:sz="4"/>
+              <w:bottom w:val="single" w:color="BFB5A5" w:sz="4"/>
+              <w:right w:val="single" w:color="BFB5A5" w:sz="4"/>
+            </w:tcBorders>
+            <w:shd w:fill="F4ECDE" w:color="auto" w:val="clear"/>
+            <w:tcMar>
+              <w:top w:type="dxa" w:w="50"/>
+              <w:left w:type="dxa" w:w="90"/>
+              <w:bottom w:type="dxa" w:w="50"/>
+              <w:right w:type="dxa" w:w="90"/>
+            </w:tcMar>
+          </w:tcPr>
+          <w:p>
+            <w:pPr>
+              <w:spacing w:after="20" w:before="0"/>
+            </w:pPr>
+            <w:r>
+              <w:rPr>
+                <w:rFonts w:ascii="Calibri" w:cs="Calibri" w:eastAsia="Calibri" w:hAnsi="Calibri"/>
+                <w:b/>
+                <w:bCs/>
+                <w:color w:val="2B2318"/>
+                <w:sz w:val="18"/>
+                <w:szCs w:val="18"/>
+              </w:rPr>
+              <w:t xml:space="preserve">Entstehung</w:t>
+            </w:r>
+          </w:p>
+        </w:tc>
+        <w:tc>
+          <w:tcPr>
+            <w:tcW w:type="dxa" w:w="7438"/>
+            <w:tcBorders>
+              <w:top w:val="single" w:color="BFB5A5" w:sz="4"/>
+              <w:left w:val="single" w:color="BFB5A5" w:sz="4"/>
+              <w:bottom w:val="single" w:color="BFB5A5" w:sz="4"/>
+              <w:right w:val="single" w:color="BFB5A5" w:sz="4"/>
+            </w:tcBorders>
+            <w:tcMar>
+              <w:top w:type="dxa" w:w="50"/>
+              <w:left w:type="dxa" w:w="90"/>
+              <w:bottom w:type="dxa" w:w="50"/>
+              <w:right w:type="dxa" w:w="90"/>
+            </w:tcMar>
+          </w:tcPr>
+          <w:p>
+            <w:pPr>
+              <w:spacing w:after="20" w:before="0"/>
+            </w:pPr>
+            <w:r>
+              <w:rPr>
+                <w:rFonts w:ascii="Calibri" w:cs="Calibri" w:eastAsia="Calibri" w:hAnsi="Calibri"/>
+                <w:b w:val="false"/>
+                <w:bCs w:val="false"/>
+                <w:color w:val="2B2318"/>
+                <w:sz w:val="18"/>
+                <w:szCs w:val="18"/>
+              </w:rPr>
+              <w:t xml:space="preserve">um 330 v. Chr. in Athen (rund 180 Jahre nach den Reformen)</w:t>
             </w:r>
           </w:p>
         </w:tc>
@@ -5271,7 +5410,7 @@
           <w:sz w:val="19"/>
           <w:szCs w:val="19"/>
         </w:rPr>
-        <w:t xml:space="preserve">–  Ich rate dir, Textart, Zeit und Ort sowie Adressat zu nennen, weil die Einleitung sonst unvollständig ist.</w:t>
+        <w:t xml:space="preserve">–  Ich rate dir, die TATTE(A)-Angaben (Titel, Textsorte, Entstehung, Adressat) zu nennen, weil die Einleitung sonst unvollständig ist.</w:t>
       </w:r>
     </w:p>
     <w:p>

</xml_diff>

<commit_message>
Geschichte 11: TATTEA ohne Klammer, Übersicht mit größerer Schrift
Co-Authored-By: Claude Opus 5.5 <noreply@anthropic.com>
Claude-Session: https://claude.ai/code/session_013iN4Tiarea1J9YUJHZ9iqC
</commit_message>
<xml_diff>
--- a/Geschichte_11/Doppelstunde_Test_Quellenanalyse/Handreichung_Test_Quellenanalyse.docx
+++ b/Geschichte_11/Doppelstunde_Test_Quellenanalyse/Handreichung_Test_Quellenanalyse.docx
@@ -1181,7 +1181,7 @@
                 <w:sz w:val="18"/>
                 <w:szCs w:val="18"/>
               </w:rPr>
-              <w:t xml:space="preserve">TATTE(A)</w:t>
+              <w:t xml:space="preserve">TATTEA</w:t>
             </w:r>
           </w:p>
         </w:tc>
@@ -2599,7 +2599,7 @@
                 <w:sz w:val="16"/>
                 <w:szCs w:val="16"/>
               </w:rPr>
-              <w:t xml:space="preserve">2a formale Aspekte mit der bekannten TATTE(A)-Formel (Titel, Autor, Textsorte, Thema, Entstehung, Adressat); an Solons Gedicht laut denkend vormachen, Einleitungssatz zeigen. Warnung: Lebensdaten prüfen.</w:t>
+              <w:t xml:space="preserve">2a formale Aspekte mit der bekannten TATTEA-Formel (Titel, Autor, Textsorte, Thema, Entstehung, Adressat); an Solons Gedicht laut denkend vormachen, Einleitungssatz zeigen. Warnung: Lebensdaten prüfen.</w:t>
             </w:r>
           </w:p>
         </w:tc>
@@ -2801,7 +2801,7 @@
                 <w:sz w:val="16"/>
                 <w:szCs w:val="16"/>
               </w:rPr>
-              <w:t xml:space="preserve">Allein: sechs TATTE(A)-Felder in 2a ausfüllen, Einleitungssatz (4). Zwei lesen vor, Lösung (2).</w:t>
+              <w:t xml:space="preserve">Allein: sechs TATTEA-Felder in 2a ausfüllen, Einleitungssatz (4). Zwei lesen vor, Lösung (2).</w:t>
             </w:r>
           </w:p>
         </w:tc>
@@ -5410,7 +5410,7 @@
           <w:sz w:val="19"/>
           <w:szCs w:val="19"/>
         </w:rPr>
-        <w:t xml:space="preserve">–  Ich rate dir, die TATTE(A)-Angaben (Titel, Textsorte, Entstehung, Adressat) zu nennen, weil die Einleitung sonst unvollständig ist.</w:t>
+        <w:t xml:space="preserve">–  Ich rate dir, die TATTEA-Angaben (Titel, Textsorte, Entstehung, Adressat) zu nennen, weil die Einleitung sonst unvollständig ist.</w:t>
       </w:r>
     </w:p>
     <w:p>

</xml_diff>